<commit_message>
refactor: professorial elevation of slides, enrich CLEAR prompts, simulated cases and datasets
- Elevate 18 weeks teaching slides (1,098 slides) with academic rigor and professorial tone
- Enforce simulated case branding 【商業教學模擬情境】 and eliminate all '連鎖餐飲' references
- Upgrade online demo resources with 5-year multi-column financial metrics and multi-chapter business proposals
- Upgrade all weekly prompts to comprehensive CLEAR templates across website and slides
- Enforce grading policy: Attendance 30% + Midterm 30% + Final 40%, zero pop quizzes/exams
</commit_message>
<xml_diff>
--- a/downloads/Week01_CLEAR提問會議紀錄練習.docx
+++ b/downloads/Week01_CLEAR提問會議紀錄練習.docx
@@ -10,7 +10,7 @@
         <w:rPr>
           <w:rFonts w:ascii="微軟正黑體" w:hAnsi="微軟正黑體"/>
           <w:color w:val="475569"/>
-          <w:sz w:val="26"/>
+          <w:sz w:val="24"/>
         </w:rPr>
         <w:t>萬能科技大學 企業管理系 11501《商業軟體應用》</w:t>
         <w:br/>
@@ -20,16 +20,15 @@
           <w:rFonts w:ascii="微軟正黑體" w:hAnsi="微軟正黑體"/>
           <w:b/>
           <w:color w:val="1E3A8A"/>
-          <w:sz w:val="36"/>
+          <w:sz w:val="34"/>
         </w:rPr>
-        <w:t>第 01 週 實務練習檔：CLEAR 提問法 ✕ 雜亂會議對話整理</w:t>
+        <w:t>第 01 週 實務練習檔：CLEAR 提問法 ✕ 跨部門季度例會對話整理實務</w:t>
       </w:r>
     </w:p>
     <w:tbl>
       <w:tblPr>
         <w:tblW w:type="auto" w:w="0"/>
         <w:jc w:val="center"/>
-        <w:tblLayout w:type="fixed"/>
         <w:tblLook w:firstColumn="1" w:firstRow="1" w:lastColumn="0" w:lastRow="0" w:noHBand="0" w:noVBand="1" w:val="04A0"/>
       </w:tblPr>
       <w:tblGrid>
@@ -46,7 +45,7 @@
             <w:r>
               <w:rPr>
                 <w:rFonts w:ascii="微軟正黑體" w:hAnsi="微軟正黑體"/>
-                <w:sz w:val="22"/>
+                <w:sz w:val="20"/>
               </w:rPr>
               <w:t>授課教師：邱俊維 博士 ｜ 班級：進企管四系 1 甲</w:t>
             </w:r>
@@ -61,7 +60,7 @@
             <w:r>
               <w:rPr>
                 <w:rFonts w:ascii="微軟正黑體" w:hAnsi="微軟正黑體"/>
-                <w:sz w:val="22"/>
+                <w:sz w:val="20"/>
               </w:rPr>
               <w:t>學生姓名：________________   學號：________________</w:t>
             </w:r>
@@ -83,36 +82,30 @@
         <w:tc>
           <w:tcPr>
             <w:tcW w:type="dxa" w:w="9360"/>
-            <w:shd w:fill="F0FDF4"/>
-            <w:tcMar>
-              <w:top w:w="140" w:type="dxa"/>
-              <w:bottom w:w="140" w:type="dxa"/>
-              <w:left w:w="200" w:type="dxa"/>
-              <w:right w:w="200" w:type="dxa"/>
-            </w:tcMar>
+            <w:shd w:fill="EFF6FF"/>
           </w:tcPr>
           <w:p>
             <w:r>
               <w:rPr>
                 <w:rFonts w:ascii="微軟正黑體" w:hAnsi="微軟正黑體"/>
                 <w:b/>
-                <w:color w:val="166534"/>
-                <w:sz w:val="22"/>
+                <w:color w:val="1E40AF"/>
+                <w:sz w:val="21"/>
               </w:rPr>
-              <w:t>🛡️ 課堂安心練習提醒（無隨堂作業打分壓力）：</w:t>
+              <w:t>🎓 課堂教學模擬情境宣告與學習指引：</w:t>
               <w:br/>
             </w:r>
             <w:r>
               <w:rPr>
                 <w:rFonts w:ascii="微軟正黑體" w:hAnsi="微軟正黑體"/>
-                <w:color w:val="14532D"/>
-                <w:sz w:val="20"/>
+                <w:color w:val="1E3A8A"/>
+                <w:sz w:val="19"/>
               </w:rPr>
-              <w:t>1. 本檔案為課堂跟著做之實務體驗檔，下課不收每週隨堂作業（本課程評分依據為出席率 30%、期中報告 30%、期末報告 40%）。</w:t>
+              <w:t>1. 【虛擬模擬宣告】：本教材所有數據、廠商名稱與會議對話均為課堂教學模擬情境（Simulated Case），非真實企業機密資料。</w:t>
               <w:br/>
-              <w:t>2. 請跟著步驟把資料複製給免費版 AI 試跑，感受 30 秒產出結構化表格的效率！</w:t>
+              <w:t>2. 【零作業負擔】：本練習為課堂實機教學演練，不需繳交隨堂作業，亦無隨堂小考壓力（學期成績採『出席 30% ＋ 期中報告 30% ＋ 期末成果 40%』）。</w:t>
               <w:br/>
-              <w:t>3. 完成後請將檔案妥善儲存至個人的 Google 雲端硬碟，作為期中報告的參考素材。</w:t>
+              <w:t>3. 【成果即資產】：請將今日課堂實作成果妥善保存於個人 Google 雲端硬碟，期中與期末書面報告可直接引用為實務成果佐證！</w:t>
             </w:r>
           </w:p>
         </w:tc>
@@ -126,17 +119,15 @@
       <w:r>
         <w:rPr>
           <w:rFonts w:ascii="微軟正黑體" w:hAnsi="微軟正黑體"/>
-          <w:color w:val="1E3A8A"/>
         </w:rPr>
-        <w:t>一、 職場情境說明</w:t>
+        <w:t>一、 商業教學模擬情境背景</w:t>
       </w:r>
     </w:p>
     <w:p>
       <w:r>
-        <w:rPr>
-          <w:rFonts w:ascii="微軟正黑體" w:hAnsi="微軟正黑體"/>
-        </w:rPr>
-        <w:t>總經理室剛開完門市營運週會，現場口語對話很雜亂，主管交代在下班前整理成正式公文格式的「會議核心摘要」與「待辦工作追蹤表」。傳統人工整理需要 30 分鐘，今天我們練習用 CLEAR 提問法指揮 AI 在 30 秒內自動排版完成！</w:t>
+        <w:t>【虛擬企業案例】：聯創商務科技股份有限公司（零售文具與生活用品事業部）。</w:t>
+        <w:br/>
+        <w:t>公司剛結束第三季例行營運檢討會議，由總經理主持，與會人員包括營運部經理（阿明）、行銷部副理（小美）、財務專員（大華）、倉儲督導（老陳）與總經理特助。現場口語討論熱烈，夾雜著多項業務問題與行動指示，亟需整理成符合 ISO 行政標準的正式會議紀錄。</w:t>
       </w:r>
     </w:p>
     <w:p>
@@ -146,46 +137,26 @@
       <w:r>
         <w:rPr>
           <w:rFonts w:ascii="微軟正黑體" w:hAnsi="微軟正黑體"/>
-          <w:color w:val="1E3A8A"/>
         </w:rPr>
-        <w:t>二、 學生給 AI 的原始口語資料（請直接複製以下文字）</w:t>
+        <w:t>二、 待整理的會議真實口語紀錄（請全選複製）</w:t>
       </w:r>
     </w:p>
-    <w:tbl>
-      <w:tblPr>
-        <w:tblW w:type="auto" w:w="0"/>
-        <w:jc w:val="center"/>
-        <w:tblLook w:firstColumn="1" w:firstRow="1" w:lastColumn="0" w:lastRow="0" w:noHBand="0" w:noVBand="1" w:val="04A0"/>
-      </w:tblPr>
-      <w:tblGrid>
-        <w:gridCol w:w="9360"/>
-      </w:tblGrid>
-      <w:tr>
-        <w:tc>
-          <w:tcPr>
-            <w:tcW w:type="dxa" w:w="9360"/>
-            <w:shd w:fill="F1F5F9"/>
-            <w:tcMar>
-              <w:top w:w="120" w:type="dxa"/>
-              <w:bottom w:w="120" w:type="dxa"/>
-              <w:left w:w="180" w:type="dxa"/>
-              <w:right w:w="180" w:type="dxa"/>
-            </w:tcMar>
-          </w:tcPr>
-          <w:p>
-            <w:r>
-              <w:rPr>
-                <w:rFonts w:ascii="微軟正黑體" w:hAnsi="微軟正黑體"/>
-                <w:color w:val="0F172A"/>
-                <w:sz w:val="22"/>
-              </w:rPr>
-              <w:t>「店長阿明說下週一要報修門市冷氣，小美說週三前會交出下個月排班表，大華說預計週五前把中秋禮盒 DM 送到各門市，另外總經理提醒大家下週開始開會時間縮短為 30 分鐘，大家都同意以上決議。」</w:t>
-            </w:r>
-          </w:p>
-        </w:tc>
-      </w:tr>
-    </w:tbl>
-    <w:p/>
+    <w:p>
+      <w:pPr>
+        <w:spacing w:line="324" w:lineRule="auto"/>
+      </w:pPr>
+      <w:r>
+        <w:t>總經理：「上個月各店營收雖然有達標，但客戶客訴率上升了 12%，特別是站前門市，客人一直反映冷氣太悶熱、燈光昏暗。另外，下個月要進第四季大檔期，各部門務必嚴格控管交期。」</w:t>
+        <w:br/>
+        <w:t>阿明（營運部）：「站前店的空調我已經問過兩家冷氣廠商，下週一上午會有一家來全面檢修壓縮機，預計報價在三萬元以內。另外，各門市下個月的輪值排班表，我要求各店長這週三下班前一定要交齊，不然會耽誤人資核算加班費。」</w:t>
+        <w:br/>
+        <w:t>小美（行銷部）：「中秋節與開學季聯合促銷的禮盒與文具 DM 昨天已經印好了，共五千份，目前暫存在總部庫房。這週五前需要各門市店長派員來領取並在門市入口完成陳列佈置。線上社群廣告預計下週二正式上線。」</w:t>
+        <w:br/>
+        <w:t>大華（財務部）：「行銷部追加的社群廣告預算五萬元，目前簽呈已經送到總經理室。提醒大家，各部門第三季的零用金與差旅發票，最遲要在本月二十五號前送過來核銷，逾期會列入下季度預算。」</w:t>
+        <w:br/>
+        <w:t>老陳（倉儲部）：「中秋禮盒的庫存量目前還有兩千盒，如果這週銷售速度不如預期，建議下週五前啟動第二波加價購促銷，避免節後造成庫存呆滯損失。」</w:t>
+      </w:r>
+    </w:p>
     <w:p>
       <w:pPr>
         <w:pStyle w:val="Heading1"/>
@@ -193,71 +164,28 @@
       <w:r>
         <w:rPr>
           <w:rFonts w:ascii="微軟正黑體" w:hAnsi="微軟正黑體"/>
-          <w:color w:val="1E3A8A"/>
         </w:rPr>
-        <w:t>三、 CLEAR 提示詞模板（請一鍵複製貼入 AI 對話視窗）</w:t>
+        <w:t>三、 CLEAR 提問法標準提示詞模板（請點擊複製貼入 AI）</w:t>
       </w:r>
     </w:p>
     <w:p>
+      <w:pPr>
+        <w:spacing w:line="300" w:lineRule="auto"/>
+      </w:pPr>
       <w:r>
-        <w:rPr>
-          <w:rFonts w:ascii="微軟正黑體" w:hAnsi="微軟正黑體"/>
-        </w:rPr>
-        <w:t>👉 請開啟免費版 Antigravity、Google Gemini (gemini.google.com) 或 ChatGPT，複製下方完整框內文字並貼上發送：</w:t>
+        <w:t>【角色設定】：你是一位具備 10 年高階行政管理經驗的企業總經理特助。</w:t>
+        <w:br/>
+        <w:t>【背景情境】：（教學模擬情境）本公司剛召開完第三季各門市營運檢討例會，討論內容較為零散。</w:t>
+        <w:br/>
+        <w:t>【約束限制】：繁體中文；嚴禁憑空捏造未提及的事項；條理分明、語氣客觀嚴謹。</w:t>
+        <w:br/>
+        <w:t>【核心任務】：請將以上口語對話整理成一份符合 ISO 規範的「高階經理人例會決議與行動追蹤表」：</w:t>
+        <w:br/>
+        <w:t>1. 會議核心決議摘要（150 字內）。</w:t>
+        <w:br/>
+        <w:t>2. 待辦追蹤執行表格（欄位包含：項次、工作項目、具體行動對策、負責同仁/部門、截止期限、優先級）。</w:t>
       </w:r>
     </w:p>
-    <w:tbl>
-      <w:tblPr>
-        <w:tblW w:type="auto" w:w="0"/>
-        <w:jc w:val="center"/>
-        <w:tblLook w:firstColumn="1" w:firstRow="1" w:lastColumn="0" w:lastRow="0" w:noHBand="0" w:noVBand="1" w:val="04A0"/>
-      </w:tblPr>
-      <w:tblGrid>
-        <w:gridCol w:w="9360"/>
-      </w:tblGrid>
-      <w:tr>
-        <w:tc>
-          <w:tcPr>
-            <w:tcW w:type="dxa" w:w="9360"/>
-            <w:shd w:fill="0F172A"/>
-            <w:tcMar>
-              <w:top w:w="160" w:type="dxa"/>
-              <w:bottom w:w="160" w:type="dxa"/>
-              <w:left w:w="200" w:type="dxa"/>
-              <w:right w:w="200" w:type="dxa"/>
-            </w:tcMar>
-          </w:tcPr>
-          <w:p>
-            <w:r>
-              <w:rPr>
-                <w:rFonts w:ascii="Consolas" w:hAnsi="Consolas"/>
-                <w:color w:val="F8FAFC"/>
-                <w:sz w:val="21"/>
-              </w:rPr>
-              <w:t>【角色】：總經理室資深行政特助</w:t>
-              <w:br/>
-              <w:t>【背景】：部門剛結束門市營運週會，現場口語對話較為零散</w:t>
-              <w:br/>
-              <w:t>【限制】：使用繁體中文；嚴格依照提供之內容整理，不可捏造未提及的人名或金額；格式必須工整清爽</w:t>
-              <w:br/>
-              <w:t>【行動】：請將以下口語對話整理成正式會議紀錄與待辦工作追蹤表</w:t>
-              <w:br/>
-              <w:t>【期望】：輸出必須包含兩部分：</w:t>
-              <w:br/>
-              <w:t xml:space="preserve">  1. 會議核心摘要（列出 2-3 點重點）</w:t>
-              <w:br/>
-              <w:t xml:space="preserve">  2. 待辦事項追蹤表格（欄位包含：項次、案由、決議、負責人、完成期限）</w:t>
-              <w:br/>
-              <w:br/>
-              <w:t>【會議對話內容】：</w:t>
-              <w:br/>
-              <w:t>店長阿明說下週一要報修門市冷氣，小美說週三前會交出下個月排班表，大華說預計週五前把中秋禮盒 DM 送到各門市，另外總經理提醒大家下週開始開會時間縮短為 30 分鐘，大家都同意以上決議。</w:t>
-            </w:r>
-          </w:p>
-        </w:tc>
-      </w:tr>
-    </w:tbl>
-    <w:p/>
     <w:p>
       <w:pPr>
         <w:pStyle w:val="Heading1"/>
@@ -265,36 +193,8 @@
       <w:r>
         <w:rPr>
           <w:rFonts w:ascii="微軟正黑體" w:hAnsi="微軟正黑體"/>
-          <w:color w:val="1E3A8A"/>
         </w:rPr>
-        <w:t>四、 AI 生成預期成果（供同學對照參考）</w:t>
-      </w:r>
-    </w:p>
-    <w:p>
-      <w:r>
-        <w:rPr>
-          <w:b/>
-        </w:rPr>
-        <w:t>【AI 生成成果示範】：</w:t>
-      </w:r>
-    </w:p>
-    <w:p>
-      <w:r>
-        <w:t>📌 會議核心摘要：</w:t>
-        <w:br/>
-        <w:t>1. 門市硬體修繕：落實店內冷氣檢修進度。</w:t>
-        <w:br/>
-        <w:t>2. 人員排班與行銷宣傳：規範排班表繳交時限，並同步推進中秋節行銷物料配送。</w:t>
-        <w:br/>
-        <w:t>3. 會議效率優化：自下週起晨會時間縮短至 30 分鐘，提升全體同仁工作效率。</w:t>
-      </w:r>
-    </w:p>
-    <w:p>
-      <w:r>
-        <w:rPr>
-          <w:b/>
-        </w:rPr>
-        <w:t>📋 門市待辦事項追蹤表：</w:t>
+        <w:t>四、 AI 產出預期成果示範對照表</w:t>
       </w:r>
     </w:p>
     <w:tbl>
@@ -319,7 +219,6 @@
           <w:p>
             <w:r>
               <w:rPr>
-                <w:rFonts w:ascii="微軟正黑體" w:hAnsi="微軟正黑體"/>
                 <w:b/>
                 <w:color w:val="FFFFFF"/>
                 <w:sz w:val="20"/>
@@ -336,12 +235,11 @@
           <w:p>
             <w:r>
               <w:rPr>
-                <w:rFonts w:ascii="微軟正黑體" w:hAnsi="微軟正黑體"/>
                 <w:b/>
                 <w:color w:val="FFFFFF"/>
                 <w:sz w:val="20"/>
               </w:rPr>
-              <w:t>案由</w:t>
+              <w:t>工作項目</w:t>
             </w:r>
           </w:p>
         </w:tc>
@@ -353,12 +251,11 @@
           <w:p>
             <w:r>
               <w:rPr>
-                <w:rFonts w:ascii="微軟正黑體" w:hAnsi="微軟正黑體"/>
                 <w:b/>
                 <w:color w:val="FFFFFF"/>
                 <w:sz w:val="20"/>
               </w:rPr>
-              <w:t>決議事項</w:t>
+              <w:t>具體行動對策</w:t>
             </w:r>
           </w:p>
         </w:tc>
@@ -370,12 +267,11 @@
           <w:p>
             <w:r>
               <w:rPr>
-                <w:rFonts w:ascii="微軟正黑體" w:hAnsi="微軟正黑體"/>
                 <w:b/>
                 <w:color w:val="FFFFFF"/>
                 <w:sz w:val="20"/>
               </w:rPr>
-              <w:t>負責人</w:t>
+              <w:t>主責人</w:t>
             </w:r>
           </w:p>
         </w:tc>
@@ -387,12 +283,11 @@
           <w:p>
             <w:r>
               <w:rPr>
-                <w:rFonts w:ascii="微軟正黑體" w:hAnsi="微軟正黑體"/>
                 <w:b/>
                 <w:color w:val="FFFFFF"/>
                 <w:sz w:val="20"/>
               </w:rPr>
-              <w:t>完成期限</w:t>
+              <w:t>截止期限</w:t>
             </w:r>
           </w:p>
         </w:tc>
@@ -406,8 +301,7 @@
           <w:p>
             <w:r>
               <w:rPr>
-                <w:rFonts w:ascii="微軟正黑體" w:hAnsi="微軟正黑體"/>
-                <w:sz w:val="20"/>
+                <w:sz w:val="19"/>
               </w:rPr>
               <w:t>1</w:t>
             </w:r>
@@ -421,10 +315,9 @@
           <w:p>
             <w:r>
               <w:rPr>
-                <w:rFonts w:ascii="微軟正黑體" w:hAnsi="微軟正黑體"/>
-                <w:sz w:val="20"/>
+                <w:sz w:val="19"/>
               </w:rPr>
-              <w:t>門市硬體維護</w:t>
+              <w:t>門市設施檢修</w:t>
             </w:r>
           </w:p>
         </w:tc>
@@ -436,10 +329,9 @@
           <w:p>
             <w:r>
               <w:rPr>
-                <w:rFonts w:ascii="微軟正黑體" w:hAnsi="微軟正黑體"/>
-                <w:sz w:val="20"/>
+                <w:sz w:val="19"/>
               </w:rPr>
-              <w:t>聯繫冷氣廠商進行門市空調全面檢修</w:t>
+              <w:t>聯繫空調廠商進行站前店冷氣壓縮機全面檢修</w:t>
             </w:r>
           </w:p>
         </w:tc>
@@ -451,10 +343,9 @@
           <w:p>
             <w:r>
               <w:rPr>
-                <w:rFonts w:ascii="微軟正黑體" w:hAnsi="微軟正黑體"/>
-                <w:sz w:val="20"/>
+                <w:sz w:val="19"/>
               </w:rPr>
-              <w:t>店長阿明</w:t>
+              <w:t>營運部 阿明</w:t>
             </w:r>
           </w:p>
         </w:tc>
@@ -466,8 +357,7 @@
           <w:p>
             <w:r>
               <w:rPr>
-                <w:rFonts w:ascii="微軟正黑體" w:hAnsi="微軟正黑體"/>
-                <w:sz w:val="20"/>
+                <w:sz w:val="19"/>
               </w:rPr>
               <w:t>下週一</w:t>
             </w:r>
@@ -483,8 +373,7 @@
           <w:p>
             <w:r>
               <w:rPr>
-                <w:rFonts w:ascii="微軟正黑體" w:hAnsi="微軟正黑體"/>
-                <w:sz w:val="20"/>
+                <w:sz w:val="19"/>
               </w:rPr>
               <w:t>2</w:t>
             </w:r>
@@ -498,10 +387,9 @@
           <w:p>
             <w:r>
               <w:rPr>
-                <w:rFonts w:ascii="微軟正黑體" w:hAnsi="微軟正黑體"/>
-                <w:sz w:val="20"/>
+                <w:sz w:val="19"/>
               </w:rPr>
-              <w:t>門市人力配置</w:t>
+              <w:t>人事排班核定</w:t>
             </w:r>
           </w:p>
         </w:tc>
@@ -513,10 +401,9 @@
           <w:p>
             <w:r>
               <w:rPr>
-                <w:rFonts w:ascii="微軟正黑體" w:hAnsi="微軟正黑體"/>
-                <w:sz w:val="20"/>
+                <w:sz w:val="19"/>
               </w:rPr>
-              <w:t>統整並繳交次月各門市輪值排班表</w:t>
+              <w:t>各門市繳交並審核次月輪值排班表</w:t>
             </w:r>
           </w:p>
         </w:tc>
@@ -528,10 +415,9 @@
           <w:p>
             <w:r>
               <w:rPr>
-                <w:rFonts w:ascii="微軟正黑體" w:hAnsi="微軟正黑體"/>
-                <w:sz w:val="20"/>
+                <w:sz w:val="19"/>
               </w:rPr>
-              <w:t>小美</w:t>
+              <w:t>營運部 阿明</w:t>
             </w:r>
           </w:p>
         </w:tc>
@@ -543,10 +429,9 @@
           <w:p>
             <w:r>
               <w:rPr>
-                <w:rFonts w:ascii="微軟正黑體" w:hAnsi="微軟正黑體"/>
-                <w:sz w:val="20"/>
+                <w:sz w:val="19"/>
               </w:rPr>
-              <w:t>週三前</w:t>
+              <w:t>本週三前</w:t>
             </w:r>
           </w:p>
         </w:tc>
@@ -560,8 +445,7 @@
           <w:p>
             <w:r>
               <w:rPr>
-                <w:rFonts w:ascii="微軟正黑體" w:hAnsi="微軟正黑體"/>
-                <w:sz w:val="20"/>
+                <w:sz w:val="19"/>
               </w:rPr>
               <w:t>3</w:t>
             </w:r>
@@ -575,10 +459,9 @@
           <w:p>
             <w:r>
               <w:rPr>
-                <w:rFonts w:ascii="微軟正黑體" w:hAnsi="微軟正黑體"/>
-                <w:sz w:val="20"/>
+                <w:sz w:val="19"/>
               </w:rPr>
-              <w:t>行銷檔期配送</w:t>
+              <w:t>行銷文宣佈置</w:t>
             </w:r>
           </w:p>
         </w:tc>
@@ -590,10 +473,9 @@
           <w:p>
             <w:r>
               <w:rPr>
-                <w:rFonts w:ascii="微軟正黑體" w:hAnsi="微軟正黑體"/>
-                <w:sz w:val="20"/>
+                <w:sz w:val="19"/>
               </w:rPr>
-              <w:t>將中秋節檔期禮盒 DM 配送至指定門市</w:t>
+              <w:t>領取 5,000 份開學與中秋 DM 並完成店面陳列佈置</w:t>
             </w:r>
           </w:p>
         </w:tc>
@@ -605,10 +487,9 @@
           <w:p>
             <w:r>
               <w:rPr>
-                <w:rFonts w:ascii="微軟正黑體" w:hAnsi="微軟正黑體"/>
-                <w:sz w:val="20"/>
+                <w:sz w:val="19"/>
               </w:rPr>
-              <w:t>大華</w:t>
+              <w:t>行銷部 小美</w:t>
             </w:r>
           </w:p>
         </w:tc>
@@ -620,16 +501,158 @@
           <w:p>
             <w:r>
               <w:rPr>
-                <w:rFonts w:ascii="微軟正黑體" w:hAnsi="微軟正黑體"/>
-                <w:sz w:val="20"/>
+                <w:sz w:val="19"/>
               </w:rPr>
-              <w:t>週五前</w:t>
+              <w:t>本週五前</w:t>
+            </w:r>
+          </w:p>
+        </w:tc>
+      </w:tr>
+      <w:tr>
+        <w:tc>
+          <w:tcPr>
+            <w:tcW w:type="dxa" w:w="1872"/>
+            <w:shd w:fill="F8FAFC"/>
+          </w:tcPr>
+          <w:p>
+            <w:r>
+              <w:rPr>
+                <w:sz w:val="19"/>
+              </w:rPr>
+              <w:t>4</w:t>
+            </w:r>
+          </w:p>
+        </w:tc>
+        <w:tc>
+          <w:tcPr>
+            <w:tcW w:type="dxa" w:w="1872"/>
+            <w:shd w:fill="F8FAFC"/>
+          </w:tcPr>
+          <w:p>
+            <w:r>
+              <w:rPr>
+                <w:sz w:val="19"/>
+              </w:rPr>
+              <w:t>財務核銷與預算</w:t>
+            </w:r>
+          </w:p>
+        </w:tc>
+        <w:tc>
+          <w:tcPr>
+            <w:tcW w:type="dxa" w:w="1872"/>
+            <w:shd w:fill="F8FAFC"/>
+          </w:tcPr>
+          <w:p>
+            <w:r>
+              <w:rPr>
+                <w:sz w:val="19"/>
+              </w:rPr>
+              <w:t>追蹤五萬元廣告簽呈並繳交 Q3 零用金發票</w:t>
+            </w:r>
+          </w:p>
+        </w:tc>
+        <w:tc>
+          <w:tcPr>
+            <w:tcW w:type="dxa" w:w="1872"/>
+            <w:shd w:fill="F8FAFC"/>
+          </w:tcPr>
+          <w:p>
+            <w:r>
+              <w:rPr>
+                <w:sz w:val="19"/>
+              </w:rPr>
+              <w:t>財務部 大華</w:t>
+            </w:r>
+          </w:p>
+        </w:tc>
+        <w:tc>
+          <w:tcPr>
+            <w:tcW w:type="dxa" w:w="1872"/>
+            <w:shd w:fill="F8FAFC"/>
+          </w:tcPr>
+          <w:p>
+            <w:r>
+              <w:rPr>
+                <w:sz w:val="19"/>
+              </w:rPr>
+              <w:t>本月 25 日前</w:t>
+            </w:r>
+          </w:p>
+        </w:tc>
+      </w:tr>
+      <w:tr>
+        <w:tc>
+          <w:tcPr>
+            <w:tcW w:type="dxa" w:w="1872"/>
+            <w:shd w:fill="FFFFFF"/>
+          </w:tcPr>
+          <w:p>
+            <w:r>
+              <w:rPr>
+                <w:sz w:val="19"/>
+              </w:rPr>
+              <w:t>5</w:t>
+            </w:r>
+          </w:p>
+        </w:tc>
+        <w:tc>
+          <w:tcPr>
+            <w:tcW w:type="dxa" w:w="1872"/>
+            <w:shd w:fill="FFFFFF"/>
+          </w:tcPr>
+          <w:p>
+            <w:r>
+              <w:rPr>
+                <w:sz w:val="19"/>
+              </w:rPr>
+              <w:t>節慶庫存監控</w:t>
+            </w:r>
+          </w:p>
+        </w:tc>
+        <w:tc>
+          <w:tcPr>
+            <w:tcW w:type="dxa" w:w="1872"/>
+            <w:shd w:fill="FFFFFF"/>
+          </w:tcPr>
+          <w:p>
+            <w:r>
+              <w:rPr>
+                <w:sz w:val="19"/>
+              </w:rPr>
+              <w:t>監控兩千盒禮盒銷量，必要時啟動第二波加價購</w:t>
+            </w:r>
+          </w:p>
+        </w:tc>
+        <w:tc>
+          <w:tcPr>
+            <w:tcW w:type="dxa" w:w="1872"/>
+            <w:shd w:fill="FFFFFF"/>
+          </w:tcPr>
+          <w:p>
+            <w:r>
+              <w:rPr>
+                <w:sz w:val="19"/>
+              </w:rPr>
+              <w:t>倉儲部 老陳</w:t>
+            </w:r>
+          </w:p>
+        </w:tc>
+        <w:tc>
+          <w:tcPr>
+            <w:tcW w:type="dxa" w:w="1872"/>
+            <w:shd w:fill="FFFFFF"/>
+          </w:tcPr>
+          <w:p>
+            <w:r>
+              <w:rPr>
+                <w:sz w:val="19"/>
+              </w:rPr>
+              <w:t>下週五前</w:t>
             </w:r>
           </w:p>
         </w:tc>
       </w:tr>
     </w:tbl>
-    <w:p/>
     <w:p>
       <w:pPr>
         <w:pStyle w:val="Heading1"/>
@@ -637,14 +660,13 @@
       <w:r>
         <w:rPr>
           <w:rFonts w:ascii="微軟正黑體" w:hAnsi="微軟正黑體"/>
-          <w:color w:val="1E3A8A"/>
         </w:rPr>
-        <w:t>五、 課堂成果留存好習慣（免交作業，存好就是資產！）</w:t>
+        <w:t>五、 雲端資產留存好習慣（為期中報告儲備素材）</w:t>
       </w:r>
     </w:p>
     <w:p>
       <w:r>
-        <w:t>1. 請將 AI 生成的表格與摘要複製下來，貼入您的個人筆記或 Google 雲端硬碟。</w:t>
+        <w:t>1. 請將 AI 生成的表格與摘要複製下來，存入個人的 Google 雲端硬碟專案資料夾。</w:t>
         <w:br/>
         <w:t>2. 檔案可命名為「20260901_第一週會議紀錄練習.docx」，養成良好的 ISO 商業存檔習慣。</w:t>
         <w:br/>
@@ -1024,6 +1046,9 @@
     <w:name w:val="Normal"/>
     <w:qFormat/>
     <w:rsid w:val="00FC693F"/>
+    <w:rPr>
+      <w:sz w:val="21"/>
+    </w:rPr>
   </w:style>
   <w:style w:type="paragraph" w:styleId="Header">
     <w:name w:val="header"/>

</xml_diff>